<commit_message>
Settle Weekly Quest decisions; rename to Daily Knowledge Complete
Decisions applied across specs and docs:
- Nothing dwarfs a level: quest bonus XP is +50/+75/+100 (about two
  levels' worth) and counts on the friend leaderboard once
- A new level counts toward every active quest needing its skill; at most
  one Chronicle quest active alongside the live quest
- Final Encounter reuses approved questions from the quest's levels
  (different requirement skills, preferring connection questions)
- Trophy rarity is measured against all active learners
- Event names follow the code: LEVEL_COMPLETE, MASTERY_CLEAR,
  DELAYED_RECALL, QUEST_COMPLETE
- Quest themes can sit in the catalog before their skill trees exist

App: daily-cap screen and Home button now say "Daily knowledge complete";
e2e checks updated.

Co-Authored-By: Claude Opus 5.5 <noreply@anthropic.com>
Claude-Session: https://claude.ai/code/session_01EwSpp1ySrzExTB2LA7xjCv
</commit_message>
<xml_diff>
--- a/brainscroll/docs/source/Social_Rewards_Expansion_Spec.docx
+++ b/brainscroll/docs/source/Social_Rewards_Expansion_Spec.docx
@@ -5656,7 +5656,7 @@
                 <w:color w:val="151A24"/>
                 <w:sz w:val="19"/>
               </w:rPr>
-              <w:t>Rarity is calculated from the percentage of eligible active users who have earned the trophy. Do not assign fake rarity labels just to make something feel special. Weekly Quest trophies follow the same rule: show a figure such as “3.2% earned” only once enough eligible learners exist to calculate it honestly.</w:t>
+              <w:t>Rarity is calculated from the percentage of all active learners who have earned the trophy. Do not assign fake rarity labels just to make something feel special. Weekly Quest trophies follow the same rule: show a figure such as “3.2% earned” only once enough learners exist to calculate it honestly.</w:t>
             </w:r>
           </w:p>
         </w:tc>
@@ -9774,7 +9774,7 @@
           <w:b/>
           <w:color w:val="7C5CFF"/>
         </w:rPr>
-        <w:t xml:space="preserve">• Quest bonuses stay off the board. Weekly Quest bonus XP is not leaderboard XP: the quest’s own levels already score, and a large one-off bonus would turn the board into a quest-completion race and let archived quests be farmed.</w:t>
+        <w:t xml:space="preserve">• Nothing dwarfs a level. Every award stays in proportion to the ~26 XP of a regular level, so no single bonus decides the week. The small Weekly Quest bonus counts once, like any verified event.</w:t>
       </w:r>
     </w:p>
     <w:p>
@@ -12178,7 +12178,7 @@
         <w:rPr>
           <w:rFonts w:ascii="Inter" w:hAnsi="Inter"/>
         </w:rPr>
-        <w:t xml:space="preserve">Completion rewards (tunable): The Roman World trophy, the title Citizen of Rome, the Marble Laurel profile treatment and +1,000 Knowledge XP. Quests are one of BrainScroll’s main sources of meaningful profile rewards: trophies, titles, backgrounds, frames, ornaments, skill emblem variants, mastery effects, XP and accomplishment-set progress. They never use coins, gems, loot boxes, currencies or a store.</w:t>
+        <w:t xml:space="preserve">Completion rewards (tunable): The Roman World trophy, the title Citizen of Rome, the Marble Laurel profile treatment and a small Knowledge XP bonus (+50 for a standard quest, +75 Epic, +100 Legendary: about two levels’ worth, so nothing dwarfs the ~26 XP a level earns). Quests are one of BrainScroll’s main sources of meaningful profile rewards: trophies, titles, backgrounds, frames, ornaments, skill emblem variants, mastery effects, XP and accomplishment-set progress. They never use coins, gems, loot boxes, currencies or a store.</w:t>
       </w:r>
     </w:p>
     <w:p>
@@ -12216,7 +12216,7 @@
           <w:b/>
           <w:color w:val="7C5CFF"/>
         </w:rPr>
-        <w:t xml:space="preserve">• One source of truth. Quest progress is read from the same verified LEVEL_COMPLETED events in the reward ledger (section 12). There is no separate quest counter, and no second copy of XP, levels or trophies.</w:t>
+        <w:t xml:space="preserve">• One source of truth. Quest progress is read from the same verified LEVEL_COMPLETE events in the reward ledger (section 12). There is no separate quest counter, and no second copy of XP, levels or trophies.</w:t>
       </w:r>
     </w:p>
     <w:p>
@@ -12242,7 +12242,20 @@
           <w:b/>
           <w:color w:val="7C5CFF"/>
         </w:rPr>
-        <w:t xml:space="preserve">• Final Encounter. At 25 / 25 the quest unlocks 3 synthesis questions that connect the week’s subjects (for The Roman World: government, geography, architecture, religion and expansion). Completing it awards the rewards. It is a short capstone, not an exam, and it does not use a daily level.</w:t>
+        <w:t xml:space="preserve">• Overlapping quests. A new level counts toward every active quest that needs its skill; there is nothing to allocate. At most one Chronicle quest is active at a time, alongside the live quest.</w:t>
+      </w:r>
+    </w:p>
+    <w:p>
+      <w:pPr>
+        <w:ind w:left="259" w:hanging="173"/>
+      </w:pPr>
+      <w:r>
+        <w:rPr>
+          <w:rFonts w:ascii="Inter" w:hAnsi="Inter"/>
+          <w:b/>
+          <w:color w:val="7C5CFF"/>
+        </w:rPr>
+        <w:t xml:space="preserve">• Final Encounter. At 25 / 25 the quest unlocks 3 synthesis questions that connect the week’s subjects (for The Roman World: government, geography, architecture, religion and expansion). They are reused approved questions from the levels the learner completed for the quest, drawn from different requirement skills and preferring connection questions, fixed once chosen. Completing it awards the rewards. It is a short capstone, not an exam, and it does not use a daily level.</w:t>
       </w:r>
     </w:p>
     <w:p>
@@ -13799,7 +13812,7 @@
                 <w:color w:val="151A24"/>
                 <w:sz w:val="17"/>
               </w:rPr>
-              <w:t xml:space="preserve">Quest definitions: title, subtitle, description, visual key, difficulty tier, start and featured-end dates, archive availability, Final Encounter, reward trophy/title/cosmetics, XP reward</w:t>
+              <w:t xml:space="preserve">Quest definitions: title, subtitle, description, visual key, difficulty tier, start and featured-end dates, archive availability, Final Encounter size (3), reward trophy/title/cosmetics, XP reward</w:t>
             </w:r>
           </w:p>
         </w:tc>
@@ -13949,7 +13962,7 @@
                 <w:color w:val="151A24"/>
                 <w:sz w:val="17"/>
               </w:rPr>
-              <w:t xml:space="preserve">Start time, Final Encounter result, live-clear flag, completion timestamp; per-requirement progress is derived from ledger events</w:t>
+              <w:t xml:space="preserve">Start time, chosen Final Encounter question IDs and result, live-clear flag, completion timestamp; per-requirement progress is derived from ledger events</w:t>
             </w:r>
           </w:p>
         </w:tc>
@@ -13989,7 +14002,7 @@
           <w:rFonts w:ascii="Inter" w:hAnsi="Inter"/>
           <w:color w:val="151A24"/>
         </w:rPr>
-        <w:t>LEVEL_COMPLETED</w:t>
+        <w:t>LEVEL_COMPLETE</w:t>
       </w:r>
     </w:p>
     <w:p>
@@ -14009,7 +14022,7 @@
           <w:rFonts w:ascii="Inter" w:hAnsi="Inter"/>
           <w:color w:val="151A24"/>
         </w:rPr>
-        <w:t>MASTERY_CHECK_PASSED</w:t>
+        <w:t>MASTERY_CLEAR</w:t>
       </w:r>
     </w:p>
     <w:p>
@@ -14029,7 +14042,7 @@
           <w:rFonts w:ascii="Inter" w:hAnsi="Inter"/>
           <w:color w:val="151A24"/>
         </w:rPr>
-        <w:t>CONCEPT_RECALLED</w:t>
+        <w:t>DELAYED_RECALL</w:t>
       </w:r>
     </w:p>
     <w:p>
@@ -14122,7 +14135,7 @@
           <w:b/>
           <w:color w:val="7C5CFF"/>
         </w:rPr>
-        <w:t xml:space="preserve">• QUEST_COMPLETED</w:t>
+        <w:t xml:space="preserve">• QUEST_COMPLETE</w:t>
       </w:r>
     </w:p>
     <w:tbl>
@@ -16521,7 +16534,7 @@
                 <w:color w:val="151A24"/>
                 <w:sz w:val="17"/>
               </w:rPr>
-              <w:t xml:space="preserve">Weekly reset is timezone-safe; score cannot be farmed through repeated reviews, purchases or quest bonuses.</w:t>
+              <w:t xml:space="preserve">Weekly reset is timezone-safe; score cannot be farmed through repeated reviews or purchases; no single award dwarfs a level.</w:t>
             </w:r>
           </w:p>
         </w:tc>

</xml_diff>